<commit_message>
seems to be done
</commit_message>
<xml_diff>
--- a/Docs/SGU - 2025_2026 - HK2 - DO AN HTTTDN.docx
+++ b/Docs/SGU - 2025_2026 - HK2 - DO AN HTTTDN.docx
@@ -4740,6 +4740,15 @@
               </w:rPr>
               <w:t xml:space="preserve">Tính lương cho mỗi nhân sự, theo quy định của doanh nghiệp. </w:t>
             </w:r>
+            <w:r>
+              <w:rPr>
+                <w:rFonts w:ascii="Times New Roman" w:eastAsia="Times New Roman" w:hAnsi="Times New Roman" w:cs="Times New Roman"/>
+                <w:color w:val="EE0000"/>
+                <w:sz w:val="24"/>
+                <w:szCs w:val="24"/>
+              </w:rPr>
+              <w:sym w:font="Wingdings 2" w:char="F050"/>
+            </w:r>
           </w:p>
           <w:p>
             <w:pPr>
@@ -4757,6 +4766,15 @@
                 <w:szCs w:val="24"/>
               </w:rPr>
               <w:t xml:space="preserve">Duyệt nhân sự nghỉ việc, nghỉ phép v.v… </w:t>
+            </w:r>
+            <w:r>
+              <w:rPr>
+                <w:rFonts w:ascii="Times New Roman" w:eastAsia="Times New Roman" w:hAnsi="Times New Roman" w:cs="Times New Roman"/>
+                <w:color w:val="EE0000"/>
+                <w:sz w:val="24"/>
+                <w:szCs w:val="24"/>
+              </w:rPr>
+              <w:sym w:font="Wingdings 2" w:char="F050"/>
             </w:r>
           </w:p>
           <w:p>

</xml_diff>